<commit_message>
docs: simplify readme and remove auxiliary greedy script
Shorten the README and remove references to the auxiliary script from both report formats. Preserve the manual counterexample and development log. Game behavior is unchanged.
</commit_message>
<xml_diff>
--- a/docs/informe-tecnico.docx
+++ b/docs/informe-tecnico.docx
@@ -3494,17 +3494,17 @@
     </w:p>
     <w:p>
       <w:r>
-        <w:t xml:space="preserve">La alternativa menos equilibrada tiene menor costo. Se suponen candidatos equiprobables y preguntas hasta identificar, sin intentos anticipados ni rival. Un intento final suma uno a ambos promedios. El ejemplo refuta la optimalidad global del criterio de preguntas; no mide victorias. </w:t>
+        <w:t xml:space="preserve">La alternativa menos equilibrada tiene menor costo. Se suponen candidatos equiprobables y preguntas hasta identificar, sin intentos anticipados ni rival. Un intento final suma uno a ambos promedios. El ejemplo refuta la optimalidad global del criterio de preguntas; no mide victorias.</w:t>
       </w:r>
       <w:r>
         <w:rPr>
           <w:rFonts w:ascii="Consolas" w:hAnsi="Consolas"/>
           <w:sz w:val="18"/>
         </w:rPr>
-        <w:t>docs/verification/greedy-counterexample.py</w:t>
-      </w:r>
-      <w:r>
-        <w:t xml:space="preserve"> verifica particiones y costos mediante enumeración exacta.</w:t>
+        <w:t/>
+      </w:r>
+      <w:r>
+        <w:t xml:space="preserve"/>
       </w:r>
     </w:p>
     <w:p>
@@ -5872,7 +5872,7 @@
     </w:p>
     <w:p>
       <w:r>
-        <w:t>La búsqueda binaria no corresponde al filtrado de atributos ni al acceso por ID: se ordena por género, la lista no ofrece acceso posicional constante y el índice por ID ya es O(1). No se explora el árbol completo ni se usa programación dinámica en el juego. La enumeración exacta del contraejemplo es una verificación documental, no una nueva estrategia del motor.</w:t>
+        <w:t>La búsqueda binaria no corresponde al filtrado de atributos ni al acceso por ID: se ordena por género, la lista no ofrece acceso posicional constante y el índice por ID ya es O(1). No se explora el árbol completo ni se usa programación dinámica en el juego.</w:t>
       </w:r>
     </w:p>
     <w:p>
@@ -6599,7 +6599,7 @@
     </w:p>
     <w:p>
       <w:r>
-        <w:t>En esta edición se contrastan fragmentos con el código, tiempos con el CSV y UML con declaraciones y campos. Se verifica el contraejemplo mediante un script independiente. No se modifican reglas, código de producción ni estadísticas locales.</w:t>
+        <w:t>En esta edición se contrastan fragmentos con el código, tiempos con el CSV y UML con declaraciones y campos. No se modifican reglas, código de producción ni estadísticas locales.</w:t>
       </w:r>
     </w:p>
     <w:p>

</xml_diff>

<commit_message>
docs: streamline technical report and remove duplicated code
Condense Greedy and persistence sections, and replace duplicate code blocks with references to the retained appendix figures.
</commit_message>
<xml_diff>
--- a/docs/informe-tecnico.docx
+++ b/docs/informe-tecnico.docx
@@ -1262,58 +1262,7 @@
     </w:p>
     <w:p>
       <w:r>
-        <w:t xml:space="preserve">MergeSort divide la lista por el punto medio, resuelve cada mitad recursivamente y las mezcla. La lista vacía o unitaria es el caso base. Este es el método real de </w:t>
-      </w:r>
-      <w:r>
-        <w:rPr>
-          <w:rFonts w:ascii="Consolas" w:hAnsi="Consolas"/>
-          <w:sz w:val="18"/>
-        </w:rPr>
-        <w:t>MazoPersonajes</w:t>
-      </w:r>
-      <w:r>
-        <w:t>:</w:t>
-      </w:r>
-    </w:p>
-    <w:p>
-      <w:pPr>
-        <w:keepLines/>
-        <w:spacing w:after="160" w:line="240" w:lineRule="auto"/>
-      </w:pPr>
-      <w:r>
-        <w:rPr>
-          <w:rFonts w:ascii="Consolas" w:hAnsi="Consolas"/>
-          <w:sz w:val="15"/>
-        </w:rPr>
-        <w:t>private static Nodo mergeSort(Nodo inicio) {</w:t>
-        <w:br/>
-        <w:t xml:space="preserve">    if (inicio == null || inicio.siguiente == null) {</w:t>
-        <w:br/>
-        <w:t xml:space="preserve">        return inicio;</w:t>
-        <w:br/>
-        <w:t xml:space="preserve">    }</w:t>
-        <w:br/>
-        <w:t xml:space="preserve">    // La referencia rápida avanza de a dos: cuando termina, la lenta marca el corte.</w:t>
-        <w:br/>
-        <w:t xml:space="preserve">    Nodo lento = inicio;</w:t>
-        <w:br/>
-        <w:t xml:space="preserve">    Nodo rapido = inicio.siguiente;</w:t>
-        <w:br/>
-        <w:t xml:space="preserve">    while (rapido != null &amp;&amp; rapido.siguiente != null) {</w:t>
-        <w:br/>
-        <w:t xml:space="preserve">        lento = lento.siguiente;</w:t>
-        <w:br/>
-        <w:t xml:space="preserve">        rapido = rapido.siguiente.siguiente;</w:t>
-        <w:br/>
-        <w:t xml:space="preserve">    }</w:t>
-        <w:br/>
-        <w:t xml:space="preserve">    Nodo derecha = lento.siguiente;</w:t>
-        <w:br/>
-        <w:t xml:space="preserve">    lento.siguiente = null;</w:t>
-        <w:br/>
-        <w:t xml:space="preserve">    return mezclar(mergeSort(inicio), mergeSort(derecha));</w:t>
-        <w:br/>
-        <w:t>}</w:t>
+        <w:t>MergeSort divide la lista por el punto medio, resuelve cada mitad recursivamente y las mezcla. La lista vacía o unitaria es el caso base. La figura 4 del Anexo A muestra el método MazoPersonajes.mergeSort.</w:t>
       </w:r>
     </w:p>
     <w:p>
@@ -1384,7 +1333,7 @@
         <w:pStyle w:val="Heading1"/>
       </w:pPr>
       <w:r>
-        <w:t>5 Greedy en la selección de preguntas</w:t>
+        <w:t>5 Greedy en las máquinas</w:t>
       </w:r>
     </w:p>
     <w:p>
@@ -1722,47 +1671,12 @@
     </w:p>
     <w:p>
       <w:r>
-        <w:t xml:space="preserve">Se sortea entre preguntas empatadas. Es Greedy porque elige la mejor evaluación local sin explorar las secuencias posteriores. Fragmento real de </w:t>
-      </w:r>
-      <w:r>
-        <w:rPr>
-          <w:rFonts w:ascii="Consolas" w:hAnsi="Consolas"/>
-          <w:sz w:val="18"/>
-        </w:rPr>
-        <w:t>EstrategiaMaquina.seleccionarPregunta</w:t>
-      </w:r>
-      <w:r>
-        <w:t>:</w:t>
+        <w:t>Se sortea entre preguntas empatadas. Es Greedy porque elige la mejor evaluación local sin explorar las secuencias posteriores. La figura 5 del Anexo A muestra la selección y el desempate en EstrategiaMaquina.seleccionarPregunta.</w:t>
       </w:r>
     </w:p>
     <w:p>
-      <w:pPr>
-        <w:keepLines/>
-        <w:spacing w:after="160" w:line="240" w:lineRule="auto"/>
-      </w:pPr>
-      <w:r>
-        <w:rPr>
-          <w:rFonts w:ascii="Consolas" w:hAnsi="Consolas"/>
-          <w:sz w:val="15"/>
-        </w:rPr>
-        <w:t>if (comparacion.esConstante()) { continue; }</w:t>
-        <w:br/>
-        <w:t>int diferencia = comparacion.getDiferencia();</w:t>
-        <w:br/>
-        <w:t>if (buscaEquilibrio ? diferencia &lt; mejorDiferencia : diferencia &gt; mejorDiferencia) {</w:t>
-        <w:br/>
-        <w:t xml:space="preserve">    mejores.clear();</w:t>
-        <w:br/>
-        <w:t xml:space="preserve">    mejorDiferencia = diferencia;</w:t>
-        <w:br/>
-        <w:t>}</w:t>
-        <w:br/>
-        <w:t>if (diferencia == mejorDiferencia) { mejores.add(pregunta); }</w:t>
-      </w:r>
-    </w:p>
-    <w:p>
-      <w:r>
-        <w:t>Con 8 candidatos, una partición 4/4 elimina siempre 4. Una 1/7 elimina 7 si el secreto está en el grupo de uno, pero solo 1 en el otro caso. Para candidatos equiprobables, la cantidad esperada restante es (s² + t²)/v: 4 frente a 6,25. Equilibrar minimiza también el promedio del siguiente paso bajo esa hipótesis; no se usa una distribución aprendida de elecciones humanas.</w:t>
+      <w:r>
+        <w:t>Con candidatos equiprobables, la cantidad esperada de candidatos restantes es (s² + t²)/v: 4 con una partición 4/4 y 6,25 con una 1/7. La política equilibrada minimiza ese valor inmediato.</w:t>
       </w:r>
     </w:p>
     <w:p>
@@ -1775,35 +1689,12 @@
     </w:p>
     <w:p>
       <w:r>
-        <w:t>Antes de preguntar, con más de un candidato, se sortea si arriesgar. La probabilidad es min(100, 4 + k·d) por ciento, con d descartes respecto del mazo original y k = 5 para Máquina 1 o 2,5 para Máquina 2. Diez descartes producen 54 % y 29 %. También cuentan los descartes heredados.</w:t>
+        <w:t>Antes de preguntar, con más de un candidato, se sortea si arriesgar. La probabilidad es min(100, 4 + k·d) por ciento, con d descartes respecto del mazo original y k = 5 para Máquina 1 o 2,5 para Máquina 2. También cuentan los descartes heredados.</w:t>
       </w:r>
     </w:p>
     <w:p>
       <w:r>
-        <w:t>El candidato se elige uniformemente entre los vivos. Con uno solo se intenta directamente; si no hay pregunta útil también se intenta. Un fallo elimina únicamente ese ID. Preguntar consume el turno aunque deje un único candidato. La probabilidad de arriesgar no equivale a la probabilidad de acertar: modela el comportamiento de cada rival.</w:t>
-      </w:r>
-    </w:p>
-    <w:p>
-      <w:r>
-        <w:br w:type="page"/>
-      </w:r>
-    </w:p>
-    <w:p>
-      <w:pPr>
-        <w:pStyle w:val="Heading1"/>
-      </w:pPr>
-      <w:r>
-        <w:t>6 Por qué Greedy puede no ser óptimo</w:t>
-      </w:r>
-    </w:p>
-    <w:p>
-      <w:r>
-        <w:t>El árbol de decisión es una interpretación de las preguntas sí/no. El programa conserva candidatos, no un árbol completo. Los atributos están relacionados por los perfiles disponibles: un filtro cambia la utilidad de los restantes. No corresponde multiplicar probabilidades suponiendo atributos independientes.</w:t>
-      </w:r>
-    </w:p>
-    <w:p>
-      <w:r>
-        <w:t>La Máquina 1 puede elegir 1/7 frente a 4/4 y terminar en la rama de siete. Su criterio no minimiza el peor caso inmediato. La Máquina 2 mejora ese criterio local, pero tampoco garantiza el menor número total de preguntas.</w:t>
+        <w:t>El candidato se elige uniformemente entre los vivos. Con uno solo se intenta directamente; si no hay pregunta útil también se intenta. Preguntar consume el turno aunque deje un único candidato. La probabilidad de arriesgar no equivale a la probabilidad de acertar: modela el comportamiento de cada rival.</w:t>
       </w:r>
     </w:p>
     <w:p>
@@ -1811,12 +1702,25 @@
         <w:pStyle w:val="Heading2"/>
       </w:pPr>
       <w:r>
-        <w:t>Contraejemplo con personajes reales del catálogo</w:t>
+        <w:t>Límite global y contraejemplo</w:t>
       </w:r>
     </w:p>
     <w:p>
       <w:r>
-        <w:t>Considérese este subconjunto ilustrativo. No se presenta como una partida observada ni una frecuencia empírica.</w:t>
+        <w:t>El programa conserva los candidatos vivos y recalcula las preguntas posibles en cada turno; no construye un árbol completo. Como cada respuesta cambia qué atributos separan a los perfiles restantes, una buena partición local no garantiza el menor promedio total de preguntas.</w:t>
+      </w:r>
+    </w:p>
+    <w:p>
+      <w:pPr>
+        <w:pStyle w:val="Heading3"/>
+      </w:pPr>
+      <w:r>
+        <w:t>Contraejemplo con personajes reales del catálogo</w:t>
+      </w:r>
+    </w:p>
+    <w:p>
+      <w:r>
+        <w:t>Consideremos estos ocho perfiles como candidatos equiprobables y preguntemos hasta identificarlos, sin intentos anticipados ni rival. Es un ejemplo ilustrativo, no una partida observada ni una frecuencia empírica.</w:t>
       </w:r>
     </w:p>
     <w:tbl>
@@ -3480,21 +3384,21 @@
     </w:p>
     <w:p>
       <w:r>
-        <w:t xml:space="preserve">«Tiene el pelo negro» divide 3/5. Género y lentes resuelven el grupo de tres con suma de profundidades 5. En el de cinco, «Le falta un diente» separa a Clara y Pilar; el color distingue esa pareja, y género y lentes resuelven el otro grupo de tres. La suma interna es 5 + 2 + 5 = 12. Total: 8 + 5 + 12 = 25, es decir, </w:t>
+        <w:t xml:space="preserve">«Tiene el pelo negro» divide 3/5. Género y lentes resuelven el grupo de tres con suma de profundidades 5. En el de cinco, «Le falta un diente» separa a Clara y Pilar; «Es pelado» las distingue, y género y lentes resuelven el otro grupo de tres. La suma interna es 5 + 2 + 5 = 12. Total: 8 + 5 + 12 = 25, es decir, 3,125 preguntas promedio.</w:t>
       </w:r>
       <w:r>
         <w:rPr>
           <w:b/>
         </w:rPr>
-        <w:t>3,125 preguntas promedio</w:t>
-      </w:r>
-      <w:r>
-        <w:t>.</w:t>
+        <w:t/>
+      </w:r>
+      <w:r>
+        <w:t/>
       </w:r>
     </w:p>
     <w:p>
       <w:r>
-        <w:t xml:space="preserve">La alternativa menos equilibrada tiene menor costo. Se suponen candidatos equiprobables y preguntas hasta identificar, sin intentos anticipados ni rival. Un intento final suma uno a ambos promedios. El ejemplo refuta la optimalidad global del criterio de preguntas; no mide victorias.</w:t>
+        <w:t xml:space="preserve">El árbol que empieza por pelo negro requiere menos preguntas en promedio (3,125 frente a 3,25), aunque ambos pueden necesitar hasta cuatro. Sumar un intento final a ambos mantiene la diferencia; el ejemplo no compara victorias.</w:t>
       </w:r>
       <w:r>
         <w:rPr>
@@ -3517,7 +3421,7 @@
         <w:pStyle w:val="Heading1"/>
       </w:pPr>
       <w:r>
-        <w:t>7 Descartes y validaciones</w:t>
+        <w:t>6 Descartes y validaciones</w:t>
       </w:r>
     </w:p>
     <w:p>
@@ -3638,7 +3542,7 @@
         <w:pStyle w:val="Heading1"/>
       </w:pPr>
       <w:r>
-        <w:t>8 Patrones de diseño y contratos</w:t>
+        <w:t>7 Patrones de diseño y contratos</w:t>
       </w:r>
     </w:p>
     <w:p>
@@ -3886,7 +3790,7 @@
         <w:pStyle w:val="Heading1"/>
       </w:pPr>
       <w:r>
-        <w:t>9 Notación Big O</w:t>
+        <w:t>8 Notación Big O</w:t>
       </w:r>
     </w:p>
     <w:p>
@@ -5426,7 +5330,7 @@
         <w:pStyle w:val="Heading1"/>
       </w:pPr>
       <w:r>
-        <w:t>10 Comparación experimental y alternativas</w:t>
+        <w:t>9 Comparación experimental y alternativas</w:t>
       </w:r>
     </w:p>
     <w:p>
@@ -5885,35 +5789,17 @@
         <w:pStyle w:val="Heading1"/>
       </w:pPr>
       <w:r>
-        <w:t>11 Persistencia e interfaz</w:t>
+        <w:t>10 Persistencia e interfaz</w:t>
       </w:r>
     </w:p>
     <w:p>
-      <w:r/>
-      <w:r>
-        <w:rPr>
-          <w:rFonts w:ascii="Consolas" w:hAnsi="Consolas"/>
-          <w:sz w:val="18"/>
-        </w:rPr>
-        <w:t>ResultadoPartida</w:t>
-      </w:r>
-      <w:r>
-        <w:t xml:space="preserve"> conserva UUID, modo y desenlace. El servicio registra una entrada por partida y deriva los contadores. Victoria verdadera suma tanto a victorias como a victorias verdaderas; perder la segunda fase deja derrota. El marcador de máquinas es independiente.</w:t>
+      <w:r>
+        <w:t>ResultadoPartida conserva UUID, modo y desenlace. El servicio registra una entrada por partida y deriva los contadores; el marcador de máquinas es independiente.</w:t>
       </w:r>
     </w:p>
     <w:p>
       <w:r>
-        <w:t xml:space="preserve">Los nombres se recortan y comparan con </w:t>
-      </w:r>
-      <w:r>
-        <w:rPr>
-          <w:rFonts w:ascii="Consolas" w:hAnsi="Consolas"/>
-          <w:sz w:val="18"/>
-        </w:rPr>
-        <w:t>equalsIgnoreCase</w:t>
-      </w:r>
-      <w:r>
-        <w:t>: Bruno y BRUNO comparten marcador, pero los acentos se distinguen. No hay autenticación. Un UUID idéntico con iguales datos no suma; un registro contradictorio se rechaza.</w:t>
+        <w:t>Los nombres se recortan y se comparan sin distinguir mayúsculas o minúsculas, pero los acentos sí se distinguen. No hay autenticación. Un UUID idéntico con iguales datos no suma; un registro contradictorio se rechaza.</w:t>
       </w:r>
     </w:p>
     <w:p>
@@ -5967,55 +5853,22 @@
         <w:pStyle w:val="Heading2"/>
       </w:pPr>
       <w:r>
-        <w:t>Coordinación de Swing</w:t>
+        <w:t>Interfaz Swing</w:t>
       </w:r>
     </w:p>
     <w:p>
-      <w:r/>
-      <w:r>
-        <w:rPr>
-          <w:rFonts w:ascii="Consolas" w:hAnsi="Consolas"/>
-          <w:sz w:val="18"/>
-        </w:rPr>
-        <w:t>Main</w:t>
-      </w:r>
-      <w:r>
-        <w:t xml:space="preserve"> abre Swing en el hilo de eventos y admite </w:t>
-      </w:r>
-      <w:r>
-        <w:rPr>
-          <w:rFonts w:ascii="Consolas" w:hAnsi="Consolas"/>
-          <w:sz w:val="18"/>
-        </w:rPr>
-        <w:t>--consola</w:t>
-      </w:r>
-      <w:r>
-        <w:t>. La ventana reúne menú, selección, partida, desafío y resultado. El humano ve su tablero, secreto, miniatura del rival e historial. Espectador dispone de dos tableros, pausa, velocidad y avance de un turno.</w:t>
+      <w:r>
+        <w:t>Main abre Swing en el hilo de eventos y admite --consola. La interfaz ofrece partidas humanas y modo espectador, que muestra ambas máquinas y permite pausar o avanzar turnos.</w:t>
       </w:r>
     </w:p>
     <w:p>
       <w:r>
-        <w:t xml:space="preserve">Un </w:t>
-      </w:r>
-      <w:r>
-        <w:rPr>
-          <w:rFonts w:ascii="Consolas" w:hAnsi="Consolas"/>
-          <w:sz w:val="18"/>
-        </w:rPr>
-        <w:t>Timer</w:t>
-      </w:r>
-      <w:r>
-        <w:t xml:space="preserve"> de una ejecución introduce la pausa de máquina. Los tokens invalidan eventos cancelados aunque estén encolados. Las estadísticas se procesan fuera del hilo gráfico mediante un ejecutor, y las respuestas vuelven al hilo de vista. Las marcas de sesión, consulta y cierre evitan aplicar respuestas obsoletas.</w:t>
+        <w:t>Un Timer regula la pausa entre turnos de máquina y el guardado se procesa fuera del hilo gráfico. Las respuestas obsoletas se descartan al cancelar una consulta o cambiar la sesión, para no actualizar una partida que ya cambió.</w:t>
       </w:r>
     </w:p>
     <w:p>
       <w:r>
-        <w:t>La vista recibe copias inmutables y diagnósticos ya calculados. No repite una decisión para mostrarla: otro sorteo podría cambiar la explicación. El guardado permite reintentos; abandonar no cuenta. Los sprites locales se asocian por ID y las cartas conservan posición al descartar. La miniatura utiliza los candidatos heredados de la segunda fase.</w:t>
-      </w:r>
-    </w:p>
-    <w:p>
-      <w:r>
-        <w:t>Estas decisiones mejoran separación y capacidad de respuesta. No cambian el costo O(r) del archivo ni eliminan el costo de reconstruir el historial.</w:t>
+        <w:t>La vista recibe copias inmutables y diagnósticos ya calculados, para mostrar el fundamento sin volver a sortear la pregunta.</w:t>
       </w:r>
     </w:p>
     <w:p>
@@ -6028,7 +5881,7 @@
         <w:pStyle w:val="Heading1"/>
       </w:pPr>
       <w:r>
-        <w:t>12 Bitácora y verificación</w:t>
+        <w:t>11 Bitácora y verificación</w:t>
       </w:r>
     </w:p>
     <w:p>
@@ -6612,7 +6465,7 @@
         <w:pStyle w:val="Heading1"/>
       </w:pPr>
       <w:r>
-        <w:t>13 Participación y reflexión</w:t>
+        <w:t>12 Participación y reflexión</w:t>
       </w:r>
     </w:p>
     <w:tbl>
@@ -7360,7 +7213,6 @@
       </w:r>
     </w:p>
     <w:p>
-      <w:r/>
       <w:r>
         <w:rPr>
           <w:b/>
@@ -7368,7 +7220,7 @@
         <w:t>Figura 4.</w:t>
       </w:r>
       <w:r>
-        <w:t xml:space="preserve"> División recursiva y combinación. Tiempo O(n log n) y pila O(log n).</w:t>
+        <w:t xml:space="preserve"> División recursiva de la lista y llamada al método de mezcla. Tiempo O(n log n) y pila O(log n).</w:t>
       </w:r>
     </w:p>
     <w:p>

</xml_diff>